<commit_message>
Rapor Inbound rapor iskelesine taşındı, Flormar paleti uygulandı
- Açık zeminli tek sayfa: sol bölüm navigasyonu, hero KPI kartları, scroll ilerleme çubuğu
- Palet Flormar marka kimliğinden: rose #E45A80, plum #2A1B22; logo hero ve navigasyonda
- Tipografi Inbound rapor şablonu: Bricolage Grotesque + Outfit (fonts/ altında)
- Yeni bölüm 04: Flormar ekibinin ilettiği 76 adreslik statik kategori URL listesinin canlı doğrulaması
- Her tablonun altında veri kaynağı, ölçüm dönemi ve kapsam
- Word sürümüne de kategori URL bölümü eklendi
</commit_message>
<xml_diff>
--- a/Flormar-SEO-Durum-Raporu-Agustos-2026.docx
+++ b/Flormar-SEO-Durum-Raporu-Agustos-2026.docx
@@ -4971,7 +4971,641 @@
           <w:color w:val="10332F"/>
           <w:sz w:val="32"/>
         </w:rPr>
-        <w:t>02 · Sıralama: KPI Kelimeleri</w:t>
+        <w:t>02 · Statik Kategori URL'leri</w:t>
+      </w:r>
+    </w:p>
+    <w:p>
+      <w:pPr>
+        <w:spacing w:before="120" w:after="160"/>
+      </w:pPr>
+      <w:r>
+        <w:rPr>
+          <w:b/>
+          <w:color w:val="E85F36"/>
+          <w:sz w:val="17"/>
+        </w:rPr>
+        <w:t xml:space="preserve">Kaynak ve yöntem: </w:t>
+      </w:r>
+      <w:r>
+        <w:rPr>
+          <w:b w:val="0"/>
+          <w:color w:val="7C8B88"/>
+          <w:sz w:val="17"/>
+        </w:rPr>
+        <w:t>Flormar ekibinin ilettiği "Eskiye Dönen Statik Kategori URL'leri - Olması Gerekenler" listesindeki 76 adresin 12 Ağu 2026 tarihindeki canlı durumu. Her adres tek tek çağrılmış; HTTP yanıtı, yönlendirme hedefi, canonical etiketi ve breadcrumb yapısı kaydedilmiştir.</w:t>
+      </w:r>
+    </w:p>
+    <w:tbl>
+      <w:tblPr>
+        <w:tblStyle w:val="TableGrid"/>
+        <w:tblW w:type="auto" w:w="0"/>
+        <w:jc w:val="center"/>
+        <w:tblLook w:firstColumn="1" w:firstRow="1" w:lastColumn="0" w:lastRow="0" w:noHBand="0" w:noVBand="1" w:val="04A0"/>
+      </w:tblPr>
+      <w:tblGrid>
+        <w:gridCol w:w="5100"/>
+        <w:gridCol w:w="5100"/>
+      </w:tblGrid>
+      <w:tr>
+        <w:tc>
+          <w:tcPr>
+            <w:tcW w:type="dxa" w:w="4535"/>
+            <w:shd w:val="clear" w:fill="434343"/>
+          </w:tcPr>
+          <w:p>
+            <w:pPr>
+              <w:jc w:val="center"/>
+            </w:pPr>
+            <w:r/>
+            <w:r>
+              <w:rPr>
+                <w:b/>
+                <w:color w:val="FFFFFF"/>
+                <w:sz w:val="16"/>
+              </w:rPr>
+              <w:t>Ölçüm</w:t>
+            </w:r>
+          </w:p>
+        </w:tc>
+        <w:tc>
+          <w:tcPr>
+            <w:tcW w:type="dxa" w:w="2268"/>
+            <w:shd w:val="clear" w:fill="434343"/>
+          </w:tcPr>
+          <w:p>
+            <w:pPr>
+              <w:jc w:val="center"/>
+            </w:pPr>
+            <w:r/>
+            <w:r>
+              <w:rPr>
+                <w:b/>
+                <w:color w:val="FFFFFF"/>
+                <w:sz w:val="16"/>
+              </w:rPr>
+              <w:t>Sonuç</w:t>
+            </w:r>
+          </w:p>
+        </w:tc>
+      </w:tr>
+      <w:tr>
+        <w:tc>
+          <w:tcPr>
+            <w:tcW w:type="dxa" w:w="4535"/>
+          </w:tcPr>
+          <w:p>
+            <w:pPr>
+              <w:spacing w:after="20"/>
+            </w:pPr>
+            <w:r/>
+            <w:r>
+              <w:rPr>
+                <w:color w:val="10332F"/>
+                <w:sz w:val="17"/>
+              </w:rPr>
+              <w:t>Listedeki adres</w:t>
+            </w:r>
+          </w:p>
+        </w:tc>
+        <w:tc>
+          <w:tcPr>
+            <w:tcW w:type="dxa" w:w="2268"/>
+          </w:tcPr>
+          <w:p>
+            <w:pPr>
+              <w:spacing w:after="20"/>
+              <w:jc w:val="center"/>
+            </w:pPr>
+            <w:r/>
+            <w:r>
+              <w:rPr>
+                <w:color w:val="10332F"/>
+                <w:sz w:val="17"/>
+              </w:rPr>
+              <w:t>76</w:t>
+            </w:r>
+          </w:p>
+        </w:tc>
+      </w:tr>
+      <w:tr>
+        <w:tc>
+          <w:tcPr>
+            <w:tcW w:type="dxa" w:w="4535"/>
+          </w:tcPr>
+          <w:p>
+            <w:pPr>
+              <w:spacing w:after="20"/>
+            </w:pPr>
+            <w:r/>
+            <w:r>
+              <w:rPr>
+                <w:color w:val="10332F"/>
+                <w:sz w:val="17"/>
+              </w:rPr>
+              <w:t>200 yanıtı veren</w:t>
+            </w:r>
+          </w:p>
+        </w:tc>
+        <w:tc>
+          <w:tcPr>
+            <w:tcW w:type="dxa" w:w="2268"/>
+          </w:tcPr>
+          <w:p>
+            <w:pPr>
+              <w:spacing w:after="20"/>
+              <w:jc w:val="center"/>
+            </w:pPr>
+            <w:r/>
+            <w:r>
+              <w:rPr>
+                <w:color w:val="10332F"/>
+                <w:sz w:val="17"/>
+              </w:rPr>
+              <w:t>74</w:t>
+            </w:r>
+          </w:p>
+        </w:tc>
+      </w:tr>
+      <w:tr>
+        <w:tc>
+          <w:tcPr>
+            <w:tcW w:type="dxa" w:w="4535"/>
+          </w:tcPr>
+          <w:p>
+            <w:pPr>
+              <w:spacing w:after="20"/>
+            </w:pPr>
+            <w:r/>
+            <w:r>
+              <w:rPr>
+                <w:color w:val="10332F"/>
+                <w:sz w:val="17"/>
+              </w:rPr>
+              <w:t>Self-referencing canonical</w:t>
+            </w:r>
+          </w:p>
+        </w:tc>
+        <w:tc>
+          <w:tcPr>
+            <w:tcW w:type="dxa" w:w="2268"/>
+          </w:tcPr>
+          <w:p>
+            <w:pPr>
+              <w:spacing w:after="20"/>
+              <w:jc w:val="center"/>
+            </w:pPr>
+            <w:r/>
+            <w:r>
+              <w:rPr>
+                <w:color w:val="10332F"/>
+                <w:sz w:val="17"/>
+              </w:rPr>
+              <w:t>74</w:t>
+            </w:r>
+          </w:p>
+        </w:tc>
+      </w:tr>
+      <w:tr>
+        <w:tc>
+          <w:tcPr>
+            <w:tcW w:type="dxa" w:w="4535"/>
+          </w:tcPr>
+          <w:p>
+            <w:pPr>
+              <w:spacing w:after="20"/>
+            </w:pPr>
+            <w:r/>
+            <w:r>
+              <w:rPr>
+                <w:color w:val="10332F"/>
+                <w:sz w:val="17"/>
+              </w:rPr>
+              <w:t>Yönlendirilen adres</w:t>
+            </w:r>
+          </w:p>
+        </w:tc>
+        <w:tc>
+          <w:tcPr>
+            <w:tcW w:type="dxa" w:w="2268"/>
+          </w:tcPr>
+          <w:p>
+            <w:pPr>
+              <w:spacing w:after="20"/>
+              <w:jc w:val="center"/>
+            </w:pPr>
+            <w:r/>
+            <w:r>
+              <w:rPr>
+                <w:color w:val="10332F"/>
+                <w:sz w:val="17"/>
+              </w:rPr>
+              <w:t>2</w:t>
+            </w:r>
+          </w:p>
+        </w:tc>
+      </w:tr>
+      <w:tr>
+        <w:tc>
+          <w:tcPr>
+            <w:tcW w:type="dxa" w:w="4535"/>
+          </w:tcPr>
+          <w:p>
+            <w:pPr>
+              <w:spacing w:after="20"/>
+            </w:pPr>
+            <w:r/>
+            <w:r>
+              <w:rPr>
+                <w:color w:val="10332F"/>
+                <w:sz w:val="17"/>
+              </w:rPr>
+              <w:t>Eski adrese dönen</w:t>
+            </w:r>
+          </w:p>
+        </w:tc>
+        <w:tc>
+          <w:tcPr>
+            <w:tcW w:type="dxa" w:w="2268"/>
+          </w:tcPr>
+          <w:p>
+            <w:pPr>
+              <w:spacing w:after="20"/>
+              <w:jc w:val="center"/>
+            </w:pPr>
+            <w:r/>
+            <w:r>
+              <w:rPr>
+                <w:color w:val="10332F"/>
+                <w:sz w:val="17"/>
+              </w:rPr>
+              <w:t>0</w:t>
+            </w:r>
+          </w:p>
+        </w:tc>
+      </w:tr>
+    </w:tbl>
+    <w:tbl>
+      <w:tblPr>
+        <w:tblStyle w:val="TableGrid"/>
+        <w:tblW w:type="auto" w:w="0"/>
+        <w:jc w:val="center"/>
+        <w:tblLook w:firstColumn="1" w:firstRow="1" w:lastColumn="0" w:lastRow="0" w:noHBand="0" w:noVBand="1" w:val="04A0"/>
+      </w:tblPr>
+      <w:tblGrid>
+        <w:gridCol w:w="2550"/>
+        <w:gridCol w:w="2550"/>
+        <w:gridCol w:w="2550"/>
+        <w:gridCol w:w="2550"/>
+      </w:tblGrid>
+      <w:tr>
+        <w:tc>
+          <w:tcPr>
+            <w:tcW w:type="dxa" w:w="3969"/>
+            <w:shd w:val="clear" w:fill="434343"/>
+          </w:tcPr>
+          <w:p>
+            <w:pPr>
+              <w:jc w:val="center"/>
+            </w:pPr>
+            <w:r/>
+            <w:r>
+              <w:rPr>
+                <w:b/>
+                <w:color w:val="FFFFFF"/>
+                <w:sz w:val="16"/>
+              </w:rPr>
+              <w:t>Listedeki adres</w:t>
+            </w:r>
+          </w:p>
+        </w:tc>
+        <w:tc>
+          <w:tcPr>
+            <w:tcW w:type="dxa" w:w="1134"/>
+            <w:shd w:val="clear" w:fill="434343"/>
+          </w:tcPr>
+          <w:p>
+            <w:pPr>
+              <w:jc w:val="center"/>
+            </w:pPr>
+            <w:r/>
+            <w:r>
+              <w:rPr>
+                <w:b/>
+                <w:color w:val="FFFFFF"/>
+                <w:sz w:val="16"/>
+              </w:rPr>
+              <w:t>HTTP</w:t>
+            </w:r>
+          </w:p>
+        </w:tc>
+        <w:tc>
+          <w:tcPr>
+            <w:tcW w:type="dxa" w:w="1928"/>
+            <w:shd w:val="clear" w:fill="434343"/>
+          </w:tcPr>
+          <w:p>
+            <w:pPr>
+              <w:jc w:val="center"/>
+            </w:pPr>
+            <w:r/>
+            <w:r>
+              <w:rPr>
+                <w:b/>
+                <w:color w:val="FFFFFF"/>
+                <w:sz w:val="16"/>
+              </w:rPr>
+              <w:t>Yönlendirme hedefi</w:t>
+            </w:r>
+          </w:p>
+        </w:tc>
+        <w:tc>
+          <w:tcPr>
+            <w:tcW w:type="dxa" w:w="2835"/>
+            <w:shd w:val="clear" w:fill="434343"/>
+          </w:tcPr>
+          <w:p>
+            <w:pPr>
+              <w:jc w:val="center"/>
+            </w:pPr>
+            <w:r/>
+            <w:r>
+              <w:rPr>
+                <w:b/>
+                <w:color w:val="FFFFFF"/>
+                <w:sz w:val="16"/>
+              </w:rPr>
+              <w:t>Bulgu</w:t>
+            </w:r>
+          </w:p>
+        </w:tc>
+      </w:tr>
+      <w:tr>
+        <w:tc>
+          <w:tcPr>
+            <w:tcW w:type="dxa" w:w="3969"/>
+          </w:tcPr>
+          <w:p>
+            <w:pPr>
+              <w:spacing w:after="20"/>
+            </w:pPr>
+            <w:r/>
+            <w:r>
+              <w:rPr>
+                <w:color w:val="10332F"/>
+                <w:sz w:val="17"/>
+              </w:rPr>
+              <w:t>/vegan-temiz-icerikli-makyaj-malzemeleri/</w:t>
+            </w:r>
+          </w:p>
+        </w:tc>
+        <w:tc>
+          <w:tcPr>
+            <w:tcW w:type="dxa" w:w="1134"/>
+          </w:tcPr>
+          <w:p>
+            <w:pPr>
+              <w:spacing w:after="20"/>
+              <w:jc w:val="center"/>
+            </w:pPr>
+            <w:r/>
+            <w:r>
+              <w:rPr>
+                <w:color w:val="10332F"/>
+                <w:sz w:val="17"/>
+              </w:rPr>
+              <w:t>301</w:t>
+            </w:r>
+          </w:p>
+        </w:tc>
+        <w:tc>
+          <w:tcPr>
+            <w:tcW w:type="dxa" w:w="1928"/>
+          </w:tcPr>
+          <w:p>
+            <w:pPr>
+              <w:spacing w:after="20"/>
+            </w:pPr>
+            <w:r/>
+            <w:r>
+              <w:rPr>
+                <w:color w:val="10332F"/>
+                <w:sz w:val="17"/>
+              </w:rPr>
+              <w:t>/kampanyalar/</w:t>
+            </w:r>
+          </w:p>
+        </w:tc>
+        <w:tc>
+          <w:tcPr>
+            <w:tcW w:type="dxa" w:w="2835"/>
+          </w:tcPr>
+          <w:p>
+            <w:pPr>
+              <w:spacing w:after="20"/>
+            </w:pPr>
+            <w:r/>
+            <w:r>
+              <w:rPr>
+                <w:color w:val="10332F"/>
+                <w:sz w:val="17"/>
+              </w:rPr>
+              <w:t>Liste dışı bir adrese yönlendiriliyor</w:t>
+            </w:r>
+          </w:p>
+        </w:tc>
+      </w:tr>
+      <w:tr>
+        <w:tc>
+          <w:tcPr>
+            <w:tcW w:type="dxa" w:w="3969"/>
+          </w:tcPr>
+          <w:p>
+            <w:pPr>
+              <w:spacing w:after="20"/>
+            </w:pPr>
+            <w:r/>
+            <w:r>
+              <w:rPr>
+                <w:color w:val="10332F"/>
+                <w:sz w:val="17"/>
+              </w:rPr>
+              <w:t>/jel-kolonya/</w:t>
+            </w:r>
+          </w:p>
+        </w:tc>
+        <w:tc>
+          <w:tcPr>
+            <w:tcW w:type="dxa" w:w="1134"/>
+          </w:tcPr>
+          <w:p>
+            <w:pPr>
+              <w:spacing w:after="20"/>
+              <w:jc w:val="center"/>
+            </w:pPr>
+            <w:r/>
+            <w:r>
+              <w:rPr>
+                <w:color w:val="10332F"/>
+                <w:sz w:val="17"/>
+              </w:rPr>
+              <w:t>301</w:t>
+            </w:r>
+          </w:p>
+        </w:tc>
+        <w:tc>
+          <w:tcPr>
+            <w:tcW w:type="dxa" w:w="1928"/>
+          </w:tcPr>
+          <w:p>
+            <w:pPr>
+              <w:spacing w:after="20"/>
+            </w:pPr>
+            <w:r/>
+            <w:r>
+              <w:rPr>
+                <w:color w:val="10332F"/>
+                <w:sz w:val="17"/>
+              </w:rPr>
+              <w:t>/kolonya/</w:t>
+            </w:r>
+          </w:p>
+        </w:tc>
+        <w:tc>
+          <w:tcPr>
+            <w:tcW w:type="dxa" w:w="2835"/>
+          </w:tcPr>
+          <w:p>
+            <w:pPr>
+              <w:spacing w:after="20"/>
+            </w:pPr>
+            <w:r/>
+            <w:r>
+              <w:rPr>
+                <w:color w:val="10332F"/>
+                <w:sz w:val="17"/>
+              </w:rPr>
+              <w:t>Liste dışı bir adrese yönlendiriliyor</w:t>
+            </w:r>
+          </w:p>
+        </w:tc>
+      </w:tr>
+    </w:tbl>
+    <w:p>
+      <w:pPr>
+        <w:spacing w:before="120" w:after="160"/>
+        <w:ind w:left="198"/>
+      </w:pPr>
+      <w:r>
+        <w:rPr>
+          <w:b/>
+          <w:color w:val="E85F36"/>
+          <w:sz w:val="20"/>
+        </w:rPr>
+        <w:t xml:space="preserve">➔  </w:t>
+      </w:r>
+      <w:r>
+        <w:rPr>
+          <w:b w:val="0"/>
+          <w:color w:val="10332F"/>
+          <w:sz w:val="19"/>
+        </w:rPr>
+        <w:t xml:space="preserve">Listedeki </w:t>
+      </w:r>
+      <w:r>
+        <w:rPr>
+          <w:b/>
+          <w:color w:val="10332F"/>
+          <w:sz w:val="19"/>
+        </w:rPr>
+        <w:t>76</w:t>
+      </w:r>
+      <w:r>
+        <w:rPr>
+          <w:b w:val="0"/>
+          <w:color w:val="10332F"/>
+          <w:sz w:val="19"/>
+        </w:rPr>
+        <w:t xml:space="preserve"> adresin </w:t>
+      </w:r>
+      <w:r>
+        <w:rPr>
+          <w:b/>
+          <w:color w:val="10332F"/>
+          <w:sz w:val="19"/>
+        </w:rPr>
+        <w:t>74</w:t>
+      </w:r>
+      <w:r>
+        <w:rPr>
+          <w:b w:val="0"/>
+          <w:color w:val="10332F"/>
+          <w:sz w:val="19"/>
+        </w:rPr>
+        <w:t xml:space="preserve">'ü </w:t>
+      </w:r>
+      <w:r>
+        <w:rPr>
+          <w:b/>
+          <w:color w:val="10332F"/>
+          <w:sz w:val="19"/>
+        </w:rPr>
+        <w:t>200</w:t>
+      </w:r>
+      <w:r>
+        <w:rPr>
+          <w:b w:val="0"/>
+          <w:color w:val="10332F"/>
+          <w:sz w:val="19"/>
+        </w:rPr>
+        <w:t xml:space="preserve"> yanıtı veriyor ve tamamında canonical etiketi kendi adresini işaret ediyor. Hiçbir adres eski bir sürüme yönlenmiyor. Ayrışan iki kayıt var: /vegan-temiz-icerikli-makyaj-malzemeleri/ adresi /kampanyalar/ adresine, /jel-kolonya/ adresi /kolonya/ adresine 301 ile yönlendiriliyor. Her ikisi de kalıcı yönlendirme olduğundan teknik olarak hatalı değil; ancak listede hedeflenen yapıdan sapma oluşturuyor.</w:t>
+      </w:r>
+    </w:p>
+    <w:p>
+      <w:pPr>
+        <w:spacing w:before="120" w:after="160"/>
+        <w:ind w:left="198"/>
+      </w:pPr>
+      <w:r>
+        <w:rPr>
+          <w:b/>
+          <w:color w:val="E85F36"/>
+          <w:sz w:val="20"/>
+        </w:rPr>
+        <w:t xml:space="preserve">➔  </w:t>
+      </w:r>
+      <w:r>
+        <w:rPr>
+          <w:b/>
+          <w:color w:val="10332F"/>
+          <w:sz w:val="19"/>
+        </w:rPr>
+        <w:t>Kapsam notu:</w:t>
+      </w:r>
+      <w:r>
+        <w:rPr>
+          <w:b w:val="0"/>
+          <w:color w:val="10332F"/>
+          <w:sz w:val="19"/>
+        </w:rPr>
+        <w:t xml:space="preserve"> Bu ölçüm tek bir zaman kesitini gösterir. Eskiye dönme tekrar eden bir davranışsa, tespiti için aynı listenin düzenli aralıklarla yeniden çağrılması gerekir; bu kontrol otomatikleştirilebilir.</w:t>
+      </w:r>
+    </w:p>
+    <w:p>
+      <w:r>
+        <w:br w:type="page"/>
+      </w:r>
+    </w:p>
+    <w:p>
+      <w:pPr>
+        <w:spacing w:before="320" w:after="60"/>
+      </w:pPr>
+      <w:r>
+        <w:rPr>
+          <w:b/>
+          <w:color w:val="10332F"/>
+          <w:sz w:val="32"/>
+        </w:rPr>
+        <w:t>03 · Sıralama: KPI Kelimeleri</w:t>
       </w:r>
     </w:p>
     <w:p>
@@ -15087,7 +15721,7 @@
           <w:color w:val="10332F"/>
           <w:sz w:val="32"/>
         </w:rPr>
-        <w:t>03 · İçerik Açığı (Content Gap)</w:t>
+        <w:t>04 · İçerik Açığı (Content Gap)</w:t>
       </w:r>
     </w:p>
     <w:p>
@@ -20610,7 +21244,7 @@
           <w:color w:val="10332F"/>
           <w:sz w:val="32"/>
         </w:rPr>
-        <w:t>04 · GEO / AI Görünürlük</w:t>
+        <w:t>05 · GEO / AI Görünürlük</w:t>
       </w:r>
     </w:p>
     <w:p>

</xml_diff>

<commit_message>
Takip derinliği dışındaki sıralamalar tire ile gösteriliyor
"takip dışı" etiketi yerine "-" kullanıldı; tablo altı notunda mobil 100.,
masaüstü 20. sıra derinliği ve tirenin anlamı belirtildi. Word sürümü de hizalandı.
</commit_message>
<xml_diff>
--- a/Flormar-SEO-Durum-Raporu-Agustos-2026.docx
+++ b/Flormar-SEO-Durum-Raporu-Agustos-2026.docx
@@ -7026,7 +7026,7 @@
                 <w:color w:val="10332F"/>
                 <w:sz w:val="17"/>
               </w:rPr>
-              <w:t>takip dışı</w:t>
+              <w:t>-</w:t>
             </w:r>
           </w:p>
         </w:tc>
@@ -7686,7 +7686,7 @@
                 <w:color w:val="10332F"/>
                 <w:sz w:val="17"/>
               </w:rPr>
-              <w:t>takip dışı</w:t>
+              <w:t>-</w:t>
             </w:r>
           </w:p>
         </w:tc>
@@ -7724,7 +7724,7 @@
                 <w:color w:val="10332F"/>
                 <w:sz w:val="17"/>
               </w:rPr>
-              <w:t>takip dışı</w:t>
+              <w:t>-</w:t>
             </w:r>
           </w:p>
         </w:tc>
@@ -8659,7 +8659,7 @@
                 <w:color w:val="10332F"/>
                 <w:sz w:val="17"/>
               </w:rPr>
-              <w:t>takip dışı</w:t>
+              <w:t>-</w:t>
             </w:r>
           </w:p>
         </w:tc>
@@ -9666,7 +9666,7 @@
                 <w:color w:val="10332F"/>
                 <w:sz w:val="17"/>
               </w:rPr>
-              <w:t>takip dışı</w:t>
+              <w:t>-</w:t>
             </w:r>
           </w:p>
         </w:tc>
@@ -9704,7 +9704,7 @@
                 <w:color w:val="10332F"/>
                 <w:sz w:val="17"/>
               </w:rPr>
-              <w:t>takip dışı</w:t>
+              <w:t>-</w:t>
             </w:r>
           </w:p>
         </w:tc>
@@ -10481,7 +10481,7 @@
                 <w:color w:val="10332F"/>
                 <w:sz w:val="17"/>
               </w:rPr>
-              <w:t>takip dışı</w:t>
+              <w:t>-</w:t>
             </w:r>
           </w:p>
         </w:tc>
@@ -10519,7 +10519,7 @@
                 <w:color w:val="10332F"/>
                 <w:sz w:val="17"/>
               </w:rPr>
-              <w:t>takip dışı</w:t>
+              <w:t>-</w:t>
             </w:r>
           </w:p>
         </w:tc>
@@ -11063,7 +11063,7 @@
                 <w:color w:val="10332F"/>
                 <w:sz w:val="17"/>
               </w:rPr>
-              <w:t>takip dışı</w:t>
+              <w:t>-</w:t>
             </w:r>
           </w:p>
         </w:tc>
@@ -11101,7 +11101,7 @@
                 <w:color w:val="10332F"/>
                 <w:sz w:val="17"/>
               </w:rPr>
-              <w:t>takip dışı</w:t>
+              <w:t>-</w:t>
             </w:r>
           </w:p>
         </w:tc>
@@ -11563,7 +11563,7 @@
                 <w:color w:val="10332F"/>
                 <w:sz w:val="17"/>
               </w:rPr>
-              <w:t>takip dışı</w:t>
+              <w:t>-</w:t>
             </w:r>
           </w:p>
         </w:tc>
@@ -11948,7 +11948,7 @@
           <w:color w:val="7C8B88"/>
           <w:sz w:val="16"/>
         </w:rPr>
-        <w:t>Kaynak: SEOmonitor · Türkiye · Mobil 100., masaüstü 20. sıraya kadar takip edilmektedir · Sıralamalar 11 Ağu 2026, karşılaştırma 12 Tem 2026 · Pozitif değer sıralama iyileşmesini gösterir</w:t>
+        <w:t>Kaynak: SEOmonitor · Türkiye · Sıralamalar 11 Ağu 2026, karşılaştırma 12 Tem 2026 · Pozitif değer sıralama iyileşmesini gösterir · Mobil sıralamalar 100., masaüstü sıralamalar 20. sıraya kadar takip edilmektedir; "-" işareti bu derinlik içinde konum oluşmadığını gösterir</w:t>
       </w:r>
     </w:p>
     <w:p>
@@ -16616,7 +16616,7 @@
                 <w:color w:val="10332F"/>
                 <w:sz w:val="17"/>
               </w:rPr>
-              <w:t>takip dışı</w:t>
+              <w:t>-</w:t>
             </w:r>
           </w:p>
         </w:tc>
@@ -16635,7 +16635,7 @@
                 <w:color w:val="10332F"/>
                 <w:sz w:val="17"/>
               </w:rPr>
-              <w:t>takip dışı</w:t>
+              <w:t>-</w:t>
             </w:r>
           </w:p>
         </w:tc>
@@ -16863,7 +16863,7 @@
                 <w:color w:val="10332F"/>
                 <w:sz w:val="17"/>
               </w:rPr>
-              <w:t>takip dışı</w:t>
+              <w:t>-</w:t>
             </w:r>
           </w:p>
         </w:tc>
@@ -16977,7 +16977,7 @@
                 <w:color w:val="10332F"/>
                 <w:sz w:val="17"/>
               </w:rPr>
-              <w:t>takip dışı</w:t>
+              <w:t>-</w:t>
             </w:r>
           </w:p>
         </w:tc>
@@ -17072,7 +17072,7 @@
                 <w:color w:val="10332F"/>
                 <w:sz w:val="17"/>
               </w:rPr>
-              <w:t>takip dışı</w:t>
+              <w:t>-</w:t>
             </w:r>
           </w:p>
         </w:tc>
@@ -17091,7 +17091,7 @@
                 <w:color w:val="10332F"/>
                 <w:sz w:val="17"/>
               </w:rPr>
-              <w:t>takip dışı</w:t>
+              <w:t>-</w:t>
             </w:r>
           </w:p>
         </w:tc>
@@ -17300,7 +17300,7 @@
                 <w:color w:val="10332F"/>
                 <w:sz w:val="17"/>
               </w:rPr>
-              <w:t>takip dışı</w:t>
+              <w:t>-</w:t>
             </w:r>
           </w:p>
         </w:tc>
@@ -17319,7 +17319,7 @@
                 <w:color w:val="10332F"/>
                 <w:sz w:val="17"/>
               </w:rPr>
-              <w:t>takip dışı</w:t>
+              <w:t>-</w:t>
             </w:r>
           </w:p>
         </w:tc>
@@ -17528,7 +17528,7 @@
                 <w:color w:val="10332F"/>
                 <w:sz w:val="17"/>
               </w:rPr>
-              <w:t>takip dışı</w:t>
+              <w:t>-</w:t>
             </w:r>
           </w:p>
         </w:tc>
@@ -17547,7 +17547,7 @@
                 <w:color w:val="10332F"/>
                 <w:sz w:val="17"/>
               </w:rPr>
-              <w:t>takip dışı</w:t>
+              <w:t>-</w:t>
             </w:r>
           </w:p>
         </w:tc>
@@ -17642,7 +17642,7 @@
                 <w:color w:val="10332F"/>
                 <w:sz w:val="17"/>
               </w:rPr>
-              <w:t>takip dışı</w:t>
+              <w:t>-</w:t>
             </w:r>
           </w:p>
         </w:tc>
@@ -17889,7 +17889,7 @@
                 <w:color w:val="10332F"/>
                 <w:sz w:val="17"/>
               </w:rPr>
-              <w:t>takip dışı</w:t>
+              <w:t>-</w:t>
             </w:r>
           </w:p>
         </w:tc>
@@ -17984,7 +17984,7 @@
                 <w:color w:val="10332F"/>
                 <w:sz w:val="17"/>
               </w:rPr>
-              <w:t>takip dışı</w:t>
+              <w:t>-</w:t>
             </w:r>
           </w:p>
         </w:tc>
@@ -18003,7 +18003,7 @@
                 <w:color w:val="10332F"/>
                 <w:sz w:val="17"/>
               </w:rPr>
-              <w:t>takip dışı</w:t>
+              <w:t>-</w:t>
             </w:r>
           </w:p>
         </w:tc>
@@ -18212,7 +18212,7 @@
                 <w:color w:val="10332F"/>
                 <w:sz w:val="17"/>
               </w:rPr>
-              <w:t>takip dışı</w:t>
+              <w:t>-</w:t>
             </w:r>
           </w:p>
         </w:tc>
@@ -18231,7 +18231,7 @@
                 <w:color w:val="10332F"/>
                 <w:sz w:val="17"/>
               </w:rPr>
-              <w:t>takip dışı</w:t>
+              <w:t>-</w:t>
             </w:r>
           </w:p>
         </w:tc>
@@ -18554,7 +18554,7 @@
                 <w:color w:val="10332F"/>
                 <w:sz w:val="17"/>
               </w:rPr>
-              <w:t>takip dışı</w:t>
+              <w:t>-</w:t>
             </w:r>
           </w:p>
         </w:tc>
@@ -18573,7 +18573,7 @@
                 <w:color w:val="10332F"/>
                 <w:sz w:val="17"/>
               </w:rPr>
-              <w:t>takip dışı</w:t>
+              <w:t>-</w:t>
             </w:r>
           </w:p>
         </w:tc>
@@ -18668,7 +18668,7 @@
                 <w:color w:val="10332F"/>
                 <w:sz w:val="17"/>
               </w:rPr>
-              <w:t>takip dışı</w:t>
+              <w:t>-</w:t>
             </w:r>
           </w:p>
         </w:tc>
@@ -18687,7 +18687,7 @@
                 <w:color w:val="10332F"/>
                 <w:sz w:val="17"/>
               </w:rPr>
-              <w:t>takip dışı</w:t>
+              <w:t>-</w:t>
             </w:r>
           </w:p>
         </w:tc>
@@ -18801,7 +18801,7 @@
                 <w:color w:val="10332F"/>
                 <w:sz w:val="17"/>
               </w:rPr>
-              <w:t>takip dışı</w:t>
+              <w:t>-</w:t>
             </w:r>
           </w:p>
         </w:tc>
@@ -18896,7 +18896,7 @@
                 <w:color w:val="10332F"/>
                 <w:sz w:val="17"/>
               </w:rPr>
-              <w:t>takip dışı</w:t>
+              <w:t>-</w:t>
             </w:r>
           </w:p>
         </w:tc>
@@ -18915,7 +18915,7 @@
                 <w:color w:val="10332F"/>
                 <w:sz w:val="17"/>
               </w:rPr>
-              <w:t>takip dışı</w:t>
+              <w:t>-</w:t>
             </w:r>
           </w:p>
         </w:tc>
@@ -19238,7 +19238,7 @@
                 <w:color w:val="10332F"/>
                 <w:sz w:val="17"/>
               </w:rPr>
-              <w:t>takip dışı</w:t>
+              <w:t>-</w:t>
             </w:r>
           </w:p>
         </w:tc>
@@ -19257,7 +19257,7 @@
                 <w:color w:val="10332F"/>
                 <w:sz w:val="17"/>
               </w:rPr>
-              <w:t>takip dışı</w:t>
+              <w:t>-</w:t>
             </w:r>
           </w:p>
         </w:tc>
@@ -19466,7 +19466,7 @@
                 <w:color w:val="10332F"/>
                 <w:sz w:val="17"/>
               </w:rPr>
-              <w:t>takip dışı</w:t>
+              <w:t>-</w:t>
             </w:r>
           </w:p>
         </w:tc>
@@ -19485,7 +19485,7 @@
                 <w:color w:val="10332F"/>
                 <w:sz w:val="17"/>
               </w:rPr>
-              <w:t>takip dışı</w:t>
+              <w:t>-</w:t>
             </w:r>
           </w:p>
         </w:tc>
@@ -20036,7 +20036,7 @@
                 <w:color w:val="10332F"/>
                 <w:sz w:val="17"/>
               </w:rPr>
-              <w:t>takip dışı</w:t>
+              <w:t>-</w:t>
             </w:r>
           </w:p>
         </w:tc>
@@ -20055,7 +20055,7 @@
                 <w:color w:val="10332F"/>
                 <w:sz w:val="17"/>
               </w:rPr>
-              <w:t>takip dışı</w:t>
+              <w:t>-</w:t>
             </w:r>
           </w:p>
         </w:tc>
@@ -20150,7 +20150,7 @@
                 <w:color w:val="10332F"/>
                 <w:sz w:val="17"/>
               </w:rPr>
-              <w:t>takip dışı</w:t>
+              <w:t>-</w:t>
             </w:r>
           </w:p>
         </w:tc>
@@ -20169,7 +20169,7 @@
                 <w:color w:val="10332F"/>
                 <w:sz w:val="17"/>
               </w:rPr>
-              <w:t>takip dışı</w:t>
+              <w:t>-</w:t>
             </w:r>
           </w:p>
         </w:tc>
@@ -20511,7 +20511,7 @@
                 <w:color w:val="10332F"/>
                 <w:sz w:val="17"/>
               </w:rPr>
-              <w:t>takip dışı</w:t>
+              <w:t>-</w:t>
             </w:r>
           </w:p>
         </w:tc>
@@ -20606,7 +20606,7 @@
                 <w:color w:val="10332F"/>
                 <w:sz w:val="17"/>
               </w:rPr>
-              <w:t>takip dışı</w:t>
+              <w:t>-</w:t>
             </w:r>
           </w:p>
         </w:tc>
@@ -20625,7 +20625,7 @@
                 <w:color w:val="10332F"/>
                 <w:sz w:val="17"/>
               </w:rPr>
-              <w:t>takip dışı</w:t>
+              <w:t>-</w:t>
             </w:r>
           </w:p>
         </w:tc>
@@ -20720,7 +20720,7 @@
                 <w:color w:val="10332F"/>
                 <w:sz w:val="17"/>
               </w:rPr>
-              <w:t>takip dışı</w:t>
+              <w:t>-</w:t>
             </w:r>
           </w:p>
         </w:tc>
@@ -20739,7 +20739,7 @@
                 <w:color w:val="10332F"/>
                 <w:sz w:val="17"/>
               </w:rPr>
-              <w:t>takip dışı</w:t>
+              <w:t>-</w:t>
             </w:r>
           </w:p>
         </w:tc>
@@ -20948,7 +20948,7 @@
                 <w:color w:val="10332F"/>
                 <w:sz w:val="17"/>
               </w:rPr>
-              <w:t>takip dışı</w:t>
+              <w:t>-</w:t>
             </w:r>
           </w:p>
         </w:tc>
@@ -20967,7 +20967,7 @@
                 <w:color w:val="10332F"/>
                 <w:sz w:val="17"/>
               </w:rPr>
-              <w:t>takip dışı</w:t>
+              <w:t>-</w:t>
             </w:r>
           </w:p>
         </w:tc>
@@ -21062,7 +21062,7 @@
                 <w:color w:val="10332F"/>
                 <w:sz w:val="17"/>
               </w:rPr>
-              <w:t>takip dışı</w:t>
+              <w:t>-</w:t>
             </w:r>
           </w:p>
         </w:tc>
@@ -21081,7 +21081,7 @@
                 <w:color w:val="10332F"/>
                 <w:sz w:val="17"/>
               </w:rPr>
-              <w:t>takip dışı</w:t>
+              <w:t>-</w:t>
             </w:r>
           </w:p>
         </w:tc>

</xml_diff>

<commit_message>
Kategori URL denetimi güncel 113 adreslik listeye taşındı
Flormar ekibinin 13 Ağu'da ilettiği yeni liste (113 adres) önceki 76 adreslik
listenin yerini aldı; 74 adres ortak, 39 adres eklendi, kapatılan 2 kategori
(/jel-kolonya/, /vegan-temiz-icerikli-makyaj-malzemeleri/) çıkarıldı.

Doğrulama sonucu (her adres tek tek çağrıldı):
- 113/113 adres yönlendirmesiz 200 yanıtı veriyor
- 113/113 adreste canonical kendi adresini işaret ediyor
- Eski sürüme dönen adres yok
- 113/113 adres kategori sitemap'inde; sitemap listeden yalnızca
  /1000-tl-alti-makyaj-setleri/ adresini fazla taşıyor
- Navigasyondaki 121 adresin tamamı dört sitemap dosyasından birinde

Bölüm dört kontrole ayrıldı, liste sürümleri arasındaki fark açılır nota alındı.
DOCX ve README aynı verilerle güncellendi.

Co-Authored-By: Claude Opus 5 <noreply@anthropic.com>
</commit_message>
<xml_diff>
--- a/Flormar-SEO-Durum-Raporu-Agustos-2026.docx
+++ b/Flormar-SEO-Durum-Raporu-Agustos-2026.docx
@@ -5201,7 +5201,7 @@
           <w:color w:val="7C8B88"/>
           <w:sz w:val="17"/>
         </w:rPr>
-        <w:t>Flormar ekibinin ilettiği "Eskiye Dönen Statik Kategori URL'leri - Olması Gerekenler" listesindeki 76 adresin 12 Ağu 2026 tarihindeki canlı durumu. Her adres tek tek çağrılmış; HTTP yanıtı, yönlendirme hedefi, canonical etiketi ve breadcrumb yapısı kaydedilmiştir.</w:t>
+        <w:t>Flormar ekibinin 13 Ağu 2026 tarihinde ilettiği güncel kategori URL listesindeki 113 adresin canlı durumu. Her adres tek tek çağrılmış; HTTP yanıtı, yönlendirme hedefi ve canonical etiketi kaydedilmiştir. Ayrıca sitemap dosyaları ve site navigasyonuyla karşılaştırılmıştır.</w:t>
       </w:r>
     </w:p>
     <w:tbl>
@@ -5291,7 +5291,7 @@
                 <w:color w:val="10332F"/>
                 <w:sz w:val="17"/>
               </w:rPr>
-              <w:t>76</w:t>
+              <w:t>113</w:t>
             </w:r>
           </w:p>
         </w:tc>
@@ -5311,7 +5311,7 @@
                 <w:color w:val="10332F"/>
                 <w:sz w:val="17"/>
               </w:rPr>
-              <w:t>200 yanıtı veren</w:t>
+              <w:t>Yönlendirmesiz 200 yanıtı veren</w:t>
             </w:r>
           </w:p>
         </w:tc>
@@ -5330,7 +5330,7 @@
                 <w:color w:val="10332F"/>
                 <w:sz w:val="17"/>
               </w:rPr>
-              <w:t>74</w:t>
+              <w:t>113</w:t>
             </w:r>
           </w:p>
         </w:tc>
@@ -5369,7 +5369,7 @@
                 <w:color w:val="10332F"/>
                 <w:sz w:val="17"/>
               </w:rPr>
-              <w:t>74</w:t>
+              <w:t>113</w:t>
             </w:r>
           </w:p>
         </w:tc>
@@ -5408,7 +5408,7 @@
                 <w:color w:val="10332F"/>
                 <w:sz w:val="17"/>
               </w:rPr>
-              <w:t>2</w:t>
+              <w:t>0</w:t>
             </w:r>
           </w:p>
         </w:tc>
@@ -5452,248 +5452,41 @@
           </w:p>
         </w:tc>
       </w:tr>
-    </w:tbl>
-    <w:tbl>
-      <w:tblPr>
-        <w:tblStyle w:val="TableGrid"/>
-        <w:tblW w:type="auto" w:w="0"/>
-        <w:jc w:val="center"/>
-        <w:tblLook w:firstColumn="1" w:firstRow="1" w:lastColumn="0" w:lastRow="0" w:noHBand="0" w:noVBand="1" w:val="04A0"/>
-      </w:tblPr>
-      <w:tblGrid>
-        <w:gridCol w:w="2550"/>
-        <w:gridCol w:w="2550"/>
-        <w:gridCol w:w="2550"/>
-        <w:gridCol w:w="2550"/>
-      </w:tblGrid>
       <w:tr>
         <w:tc>
           <w:tcPr>
-            <w:tcW w:type="dxa" w:w="3969"/>
-            <w:shd w:val="clear" w:fill="434343"/>
-          </w:tcPr>
-          <w:p>
-            <w:pPr>
-              <w:jc w:val="center"/>
-            </w:pPr>
-            <w:r/>
-            <w:r>
-              <w:rPr>
-                <w:b/>
-                <w:color w:val="FFFFFF"/>
-                <w:sz w:val="16"/>
-              </w:rPr>
-              <w:t>Listedeki adres</w:t>
-            </w:r>
-          </w:p>
-        </w:tc>
-        <w:tc>
-          <w:tcPr>
-            <w:tcW w:type="dxa" w:w="1134"/>
-            <w:shd w:val="clear" w:fill="434343"/>
-          </w:tcPr>
-          <w:p>
-            <w:pPr>
-              <w:jc w:val="center"/>
-            </w:pPr>
-            <w:r/>
-            <w:r>
-              <w:rPr>
-                <w:b/>
-                <w:color w:val="FFFFFF"/>
-                <w:sz w:val="16"/>
-              </w:rPr>
-              <w:t>HTTP</w:t>
-            </w:r>
-          </w:p>
-        </w:tc>
-        <w:tc>
-          <w:tcPr>
-            <w:tcW w:type="dxa" w:w="1928"/>
-            <w:shd w:val="clear" w:fill="434343"/>
-          </w:tcPr>
-          <w:p>
-            <w:pPr>
-              <w:jc w:val="center"/>
-            </w:pPr>
-            <w:r/>
-            <w:r>
-              <w:rPr>
-                <w:b/>
-                <w:color w:val="FFFFFF"/>
-                <w:sz w:val="16"/>
-              </w:rPr>
-              <w:t>Yönlendirme hedefi</w:t>
-            </w:r>
-          </w:p>
-        </w:tc>
-        <w:tc>
-          <w:tcPr>
-            <w:tcW w:type="dxa" w:w="2835"/>
-            <w:shd w:val="clear" w:fill="434343"/>
-          </w:tcPr>
-          <w:p>
-            <w:pPr>
-              <w:jc w:val="center"/>
-            </w:pPr>
-            <w:r/>
-            <w:r>
-              <w:rPr>
-                <w:b/>
-                <w:color w:val="FFFFFF"/>
-                <w:sz w:val="16"/>
-              </w:rPr>
-              <w:t>Bulgu</w:t>
-            </w:r>
-          </w:p>
-        </w:tc>
-      </w:tr>
-      <w:tr>
-        <w:tc>
-          <w:tcPr>
-            <w:tcW w:type="dxa" w:w="3969"/>
-          </w:tcPr>
-          <w:p>
-            <w:pPr>
-              <w:spacing w:after="20"/>
-            </w:pPr>
-            <w:r/>
-            <w:r>
-              <w:rPr>
-                <w:color w:val="10332F"/>
-                <w:sz w:val="17"/>
-              </w:rPr>
-              <w:t>/vegan-temiz-icerikli-makyaj-malzemeleri/</w:t>
-            </w:r>
-          </w:p>
-        </w:tc>
-        <w:tc>
-          <w:tcPr>
-            <w:tcW w:type="dxa" w:w="1134"/>
-          </w:tcPr>
-          <w:p>
-            <w:pPr>
-              <w:spacing w:after="20"/>
-              <w:jc w:val="center"/>
-            </w:pPr>
-            <w:r/>
-            <w:r>
-              <w:rPr>
-                <w:color w:val="10332F"/>
-                <w:sz w:val="17"/>
-              </w:rPr>
-              <w:t>301</w:t>
-            </w:r>
-          </w:p>
-        </w:tc>
-        <w:tc>
-          <w:tcPr>
-            <w:tcW w:type="dxa" w:w="1928"/>
-          </w:tcPr>
-          <w:p>
-            <w:pPr>
-              <w:spacing w:after="20"/>
-            </w:pPr>
-            <w:r/>
-            <w:r>
-              <w:rPr>
-                <w:color w:val="10332F"/>
-                <w:sz w:val="17"/>
-              </w:rPr>
-              <w:t>/kampanyalar/</w:t>
-            </w:r>
-          </w:p>
-        </w:tc>
-        <w:tc>
-          <w:tcPr>
-            <w:tcW w:type="dxa" w:w="2835"/>
-          </w:tcPr>
-          <w:p>
-            <w:pPr>
-              <w:spacing w:after="20"/>
-            </w:pPr>
-            <w:r/>
-            <w:r>
-              <w:rPr>
-                <w:color w:val="10332F"/>
-                <w:sz w:val="17"/>
-              </w:rPr>
-              <w:t>Liste dışı bir adrese yönlendiriliyor</w:t>
-            </w:r>
-          </w:p>
-        </w:tc>
-      </w:tr>
-      <w:tr>
-        <w:tc>
-          <w:tcPr>
-            <w:tcW w:type="dxa" w:w="3969"/>
-          </w:tcPr>
-          <w:p>
-            <w:pPr>
-              <w:spacing w:after="20"/>
-            </w:pPr>
-            <w:r/>
-            <w:r>
-              <w:rPr>
-                <w:color w:val="10332F"/>
-                <w:sz w:val="17"/>
-              </w:rPr>
-              <w:t>/jel-kolonya/</w:t>
-            </w:r>
-          </w:p>
-        </w:tc>
-        <w:tc>
-          <w:tcPr>
-            <w:tcW w:type="dxa" w:w="1134"/>
-          </w:tcPr>
-          <w:p>
-            <w:pPr>
-              <w:spacing w:after="20"/>
-              <w:jc w:val="center"/>
-            </w:pPr>
-            <w:r/>
-            <w:r>
-              <w:rPr>
-                <w:color w:val="10332F"/>
-                <w:sz w:val="17"/>
-              </w:rPr>
-              <w:t>301</w:t>
-            </w:r>
-          </w:p>
-        </w:tc>
-        <w:tc>
-          <w:tcPr>
-            <w:tcW w:type="dxa" w:w="1928"/>
-          </w:tcPr>
-          <w:p>
-            <w:pPr>
-              <w:spacing w:after="20"/>
-            </w:pPr>
-            <w:r/>
-            <w:r>
-              <w:rPr>
-                <w:color w:val="10332F"/>
-                <w:sz w:val="17"/>
-              </w:rPr>
-              <w:t>/kolonya/</w:t>
-            </w:r>
-          </w:p>
-        </w:tc>
-        <w:tc>
-          <w:tcPr>
-            <w:tcW w:type="dxa" w:w="2835"/>
-          </w:tcPr>
-          <w:p>
-            <w:pPr>
-              <w:spacing w:after="20"/>
-            </w:pPr>
-            <w:r/>
-            <w:r>
-              <w:rPr>
-                <w:color w:val="10332F"/>
-                <w:sz w:val="17"/>
-              </w:rPr>
-              <w:t>Liste dışı bir adrese yönlendiriliyor</w:t>
+            <w:tcW w:type="dxa" w:w="4535"/>
+          </w:tcPr>
+          <w:p>
+            <w:pPr>
+              <w:spacing w:after="20"/>
+            </w:pPr>
+            <w:r/>
+            <w:r>
+              <w:rPr>
+                <w:color w:val="10332F"/>
+                <w:sz w:val="17"/>
+              </w:rPr>
+              <w:t>Sitemap kapsamı dışında kalan</w:t>
+            </w:r>
+          </w:p>
+        </w:tc>
+        <w:tc>
+          <w:tcPr>
+            <w:tcW w:type="dxa" w:w="2268"/>
+          </w:tcPr>
+          <w:p>
+            <w:pPr>
+              <w:spacing w:after="20"/>
+              <w:jc w:val="center"/>
+            </w:pPr>
+            <w:r/>
+            <w:r>
+              <w:rPr>
+                <w:color w:val="10332F"/>
+                <w:sz w:val="17"/>
+              </w:rPr>
+              <w:t>0</w:t>
             </w:r>
           </w:p>
         </w:tc>
@@ -5726,7 +5519,7 @@
           <w:color w:val="10332F"/>
           <w:sz w:val="19"/>
         </w:rPr>
-        <w:t>76</w:t>
+        <w:t>113</w:t>
       </w:r>
       <w:r>
         <w:rPr>
@@ -5734,23 +5527,7 @@
           <w:color w:val="10332F"/>
           <w:sz w:val="19"/>
         </w:rPr>
-        <w:t xml:space="preserve"> adresin </w:t>
-      </w:r>
-      <w:r>
-        <w:rPr>
-          <w:b/>
-          <w:color w:val="10332F"/>
-          <w:sz w:val="19"/>
-        </w:rPr>
-        <w:t>74</w:t>
-      </w:r>
-      <w:r>
-        <w:rPr>
-          <w:b w:val="0"/>
-          <w:color w:val="10332F"/>
-          <w:sz w:val="19"/>
-        </w:rPr>
-        <w:t xml:space="preserve">'ü </w:t>
+        <w:t xml:space="preserve"> adresin tamamı yönlendirmesiz </w:t>
       </w:r>
       <w:r>
         <w:rPr>
@@ -5766,7 +5543,61 @@
           <w:color w:val="10332F"/>
           <w:sz w:val="19"/>
         </w:rPr>
-        <w:t xml:space="preserve"> yanıtı veriyor ve tamamında canonical etiketi kendi adresini işaret ediyor. Hiçbir adres eski bir sürüme yönlenmiyor. Ayrışan iki kayıt var: /vegan-temiz-icerikli-makyaj-malzemeleri/ adresi /kampanyalar/ adresine, /jel-kolonya/ adresi /kolonya/ adresine 301 ile yönlendiriliyor. Her ikisi de kalıcı yönlendirme olduğundan teknik olarak hatalı değil; ancak listede hedeflenen yapıdan sapma oluşturuyor.</w:t>
+        <w:t xml:space="preserve"> yanıtı vermekte ve tamamında canonical etiketi kendi adresini işaret etmektedir. </w:t>
+      </w:r>
+      <w:r>
+        <w:rPr>
+          <w:b/>
+          <w:color w:val="10332F"/>
+          <w:sz w:val="19"/>
+        </w:rPr>
+        <w:t>Eski bir sürüme dönen adres bulunmamaktadır.</w:t>
+      </w:r>
+      <w:r>
+        <w:rPr>
+          <w:b w:val="0"/>
+          <w:color w:val="10332F"/>
+          <w:sz w:val="19"/>
+        </w:rPr>
+        <w:t xml:space="preserve"> Adreslerin tamamı kategori sitemap'inde yer almakta; sitemap listeden yalnızca bir adres fazla taşımaktadır (/1000-tl-alti-makyaj-setleri/).</w:t>
+      </w:r>
+    </w:p>
+    <w:p>
+      <w:pPr>
+        <w:spacing w:before="120" w:after="160"/>
+        <w:ind w:left="198"/>
+      </w:pPr>
+      <w:r>
+        <w:rPr>
+          <w:b/>
+          <w:color w:val="E85F36"/>
+          <w:sz w:val="20"/>
+        </w:rPr>
+        <w:t xml:space="preserve">➔  </w:t>
+      </w:r>
+      <w:r>
+        <w:rPr>
+          <w:b w:val="0"/>
+          <w:color w:val="10332F"/>
+          <w:sz w:val="19"/>
+        </w:rPr>
+        <w:t xml:space="preserve">Site navigasyonundan erişilen </w:t>
+      </w:r>
+      <w:r>
+        <w:rPr>
+          <w:b/>
+          <w:color w:val="10332F"/>
+          <w:sz w:val="19"/>
+        </w:rPr>
+        <w:t>121</w:t>
+      </w:r>
+      <w:r>
+        <w:rPr>
+          <w:b w:val="0"/>
+          <w:color w:val="10332F"/>
+          <w:sz w:val="19"/>
+        </w:rPr>
+        <w:t xml:space="preserve"> adresin tamamı dört sitemap dosyasından birinde bulunmaktadır (kategoriler, flatpages, ürünler, özel sayfalar; toplam 1.688 adres). Navigasyonda olup sitemap dışında kalan sayfa bulunmamaktadır.</w:t>
       </w:r>
     </w:p>
     <w:p>

</xml_diff>

<commit_message>
AI Search SoV Inbound izlemesine taşındı, kartlara ilk 3 eklendi, mobil başlık hizalandı
- AI Search Share of Voice artık Inbound AI görünürlük izlemesinden geliyor:
  100 prompt, ChatGPT ve Gemini, 1-12 Ağu. Flormar 159 anılmayla %26.9 ve
  kategoride 1. sıra (önceki değer SEOmonitor'ün %16.1'iydi)
- GEO bölümüne marka bazlı AI Search SoV tablosu eklendi; iki kaynağın neden
  farklı değer verdiği açılır notta anlatıldı, ikisi de tabloda kaynağıyla duruyor
- Sıralama bildiren KPI kartlarının altına ilk 3 listesi eklendi (tıklama payı
  ve AI Search); marka satırı vurgulu
- Mobilde marka logosu ile Inbound logosu aynı satırda, "Hazırlayan" etiketi
  dar ekranda gizli; rapor başlığı alt satıra alındı
- Terim sözlüğündeki Share of Voice tanımı düzeltildi: artık yapay zeka
  görünüm payını anlatıyor, tıklama payıyla karışmıyor

Co-Authored-By: Claude Opus 5 <noreply@anthropic.com>
</commit_message>
<xml_diff>
--- a/Flormar-SEO-Durum-Raporu-Agustos-2026.docx
+++ b/Flormar-SEO-Durum-Raporu-Agustos-2026.docx
@@ -504,7 +504,7 @@
                 <w:color w:val="10332F"/>
                 <w:sz w:val="17"/>
               </w:rPr>
-              <w:t>%16.1</w:t>
+              <w:t>%26.9</w:t>
             </w:r>
           </w:p>
         </w:tc>
@@ -522,7 +522,7 @@
                 <w:color w:val="10332F"/>
                 <w:sz w:val="17"/>
               </w:rPr>
-              <w:t>Kategoride 3. sıra</w:t>
+              <w:t>Kategoride 1. sıra · 159 anılma</w:t>
             </w:r>
           </w:p>
         </w:tc>
@@ -21380,6 +21380,98 @@
                 <w:sz w:val="17"/>
               </w:rPr>
               <w:t>1-12 Ağu 2026 · 100 aktif prompt · 505 taranan yanıt</w:t>
+            </w:r>
+          </w:p>
+        </w:tc>
+      </w:tr>
+      <w:tr>
+        <w:tc>
+          <w:tcPr>
+            <w:tcW w:type="dxa" w:w="1814"/>
+          </w:tcPr>
+          <w:p>
+            <w:pPr>
+              <w:spacing w:after="20"/>
+            </w:pPr>
+            <w:r/>
+            <w:r>
+              <w:rPr>
+                <w:color w:val="10332F"/>
+                <w:sz w:val="17"/>
+              </w:rPr>
+              <w:t>AI Search Share of Voice</w:t>
+            </w:r>
+          </w:p>
+        </w:tc>
+        <w:tc>
+          <w:tcPr>
+            <w:tcW w:type="dxa" w:w="1474"/>
+          </w:tcPr>
+          <w:p>
+            <w:pPr>
+              <w:spacing w:after="20"/>
+            </w:pPr>
+            <w:r/>
+            <w:r>
+              <w:rPr>
+                <w:color w:val="10332F"/>
+                <w:sz w:val="17"/>
+              </w:rPr>
+              <w:t>%26.9 · 1. sıra</w:t>
+            </w:r>
+          </w:p>
+        </w:tc>
+        <w:tc>
+          <w:tcPr>
+            <w:tcW w:type="dxa" w:w="2835"/>
+          </w:tcPr>
+          <w:p>
+            <w:pPr>
+              <w:spacing w:after="20"/>
+            </w:pPr>
+            <w:r/>
+            <w:r>
+              <w:rPr>
+                <w:color w:val="10332F"/>
+                <w:sz w:val="17"/>
+              </w:rPr>
+              <w:t>Maybelline %21.7 · Golden Rose %18.1 · NYX %13.7 · Watsons %10.3</w:t>
+            </w:r>
+          </w:p>
+        </w:tc>
+        <w:tc>
+          <w:tcPr>
+            <w:tcW w:type="dxa" w:w="1587"/>
+          </w:tcPr>
+          <w:p>
+            <w:pPr>
+              <w:spacing w:after="20"/>
+            </w:pPr>
+            <w:r/>
+            <w:r>
+              <w:rPr>
+                <w:color w:val="10332F"/>
+                <w:sz w:val="17"/>
+              </w:rPr>
+              <w:t>Inbound AI görünürlük izleme</w:t>
+            </w:r>
+          </w:p>
+        </w:tc>
+        <w:tc>
+          <w:tcPr>
+            <w:tcW w:type="dxa" w:w="2154"/>
+          </w:tcPr>
+          <w:p>
+            <w:pPr>
+              <w:spacing w:after="20"/>
+            </w:pPr>
+            <w:r/>
+            <w:r>
+              <w:rPr>
+                <w:color w:val="10332F"/>
+                <w:sz w:val="17"/>
+              </w:rPr>
+              <w:t>1-12 Ağu 2026 · ChatGPT ve Gemini · 100 aktif prompt</w:t>
             </w:r>
           </w:p>
         </w:tc>

</xml_diff>

<commit_message>
Marka kelime tanımı genişletildi, GEO sıralamasına Flormar eklendi
- Kiss Me ve Sheer Up Flormar koleksiyon adı olduğundan marka kelimesi
  sayılıyor; brand tespiti artık flormar, k-spirit, kiss me ve sheer up
  terimlerini kapsıyor. Brand kayıt sayısı 2'den 3'e çıktı
- GEO konum özetinde rakip listesi yalnız rakipleri gösteriyordu; Flormar da
  kendi sırasında listeye eklendi ve vurgulandı (mention ve AI Search SoV'de
  1. sıra, citation'da 6., AI Overview SoV'de 5.)
- Kategori ve rakip tablosundan SEOmonitor fırsat skoru sütunu çıkarıldı
- Özet bölümündeki Product schema alan bütünlüğü yorumu kaldırıldı
- Sephora logosu koyu zeminli favicon olduğu için açık kartlarda görünmüyordu;
  alev şekli ayrıştırılıp şeffaf zeminli koyu sürüme çevrildi
- Kullanılmayan sitemap ve navigasyon veri yüklemeleri generator'dan kaldırıldı

Co-Authored-By: Claude Opus 5 <noreply@anthropic.com>
</commit_message>
<xml_diff>
--- a/Flormar-SEO-Durum-Raporu-Agustos-2026.docx
+++ b/Flormar-SEO-Durum-Raporu-Agustos-2026.docx
@@ -21246,7 +21246,7 @@
                 <w:color w:val="10332F"/>
                 <w:sz w:val="17"/>
               </w:rPr>
-              <w:t>1. Maybelline 187 · 2. Golden Rose 124 · 3. Watsons 108 · 4. Trendyol 94 · 5. NYX Cosmetics 80</w:t>
+              <w:t>1. Flormar 211 · 2. Maybelline 187 · 3. Golden Rose 124 · 4. Watsons 108 · 5. Trendyol 94 · 6. NYX Cosmetics 80</w:t>
             </w:r>
           </w:p>
         </w:tc>
@@ -21320,7 +21320,7 @@
                 <w:color w:val="10332F"/>
                 <w:sz w:val="17"/>
               </w:rPr>
-              <w:t>1. Maybelline %21.7 · 2. Golden Rose %18.1 · 3. NYX Cosmetics %13.7 · 4. Watsons %10.3</w:t>
+              <w:t>1. Flormar %26.9 · 2. Maybelline %21.7 · 3. Golden Rose %18.1 · 4. NYX Cosmetics %13.7 · 5. Watsons %10.3</w:t>
             </w:r>
           </w:p>
         </w:tc>
@@ -21394,7 +21394,7 @@
                 <w:color w:val="10332F"/>
                 <w:sz w:val="17"/>
               </w:rPr>
-              <w:t>1. Trendyol 359 · 2. makyajtrendi.com 197 · 3. Watsons 180 · 4. instagram.com 178 · 5. Sephora 117</w:t>
+              <w:t>1. Trendyol 359 · 2. makyajtrendi.com 197 · 3. Watsons 180 · 4. instagram.com 178 · 5. Sephora 117 · 6. Flormar 114</w:t>
             </w:r>
           </w:p>
         </w:tc>
@@ -21468,7 +21468,7 @@
                 <w:color w:val="10332F"/>
                 <w:sz w:val="17"/>
               </w:rPr>
-              <w:t>1. Trendyol %27.0 · 2. Watsons %21.6 · 3. Sephora %18.5 · 4. eveshop.com.tr %11.0</w:t>
+              <w:t>1. Trendyol %27.0 · 2. Watsons %21.6 · 3. Sephora %18.5 · 4. eveshop.com.tr %11.0 · 5. Flormar %9.7</w:t>
             </w:r>
           </w:p>
         </w:tc>

</xml_diff>

<commit_message>
Platform tablosuna citation eklendi, mention paydası ve konum özeti açıklamaları
- Prompt tabanlı ölçüm tablosuna Site citation ve Citation oranı sütunları
  eklendi: yanıtın kaynak olarak flormar.com.tr'ye bağlandığı kayıt sayısı ve
  o platformdaki orana. Gemini 48/190 (%25.3), ChatGPT 26/129 (%20.2),
  Google AI Overview 30/186 (%16.1)
- AI Search Share of Voice tablosunda sütun adı "Mention (ChatGPT + Gemini
  toplamı)" oldu ve değerler mention / taranan yanıt biçiminde veriliyor
  (Flormar 159 / 319)
- Konum özetindeki ölçüm adları açıklama taşıyor: mention, AI Search Share of
  Voice, citation ve AI Overview Share of Voice

Co-Authored-By: Claude Opus 5 <noreply@anthropic.com>
</commit_message>
<xml_diff>
--- a/Flormar-SEO-Durum-Raporu-Agustos-2026.docx
+++ b/Flormar-SEO-Durum-Raporu-Agustos-2026.docx
@@ -20677,16 +20677,18 @@
         <w:tblLook w:firstColumn="1" w:firstRow="1" w:lastColumn="0" w:lastRow="0" w:noHBand="0" w:noVBand="1" w:val="04A0"/>
       </w:tblPr>
       <w:tblGrid>
-        <w:gridCol w:w="2040"/>
-        <w:gridCol w:w="2040"/>
-        <w:gridCol w:w="2040"/>
-        <w:gridCol w:w="2040"/>
-        <w:gridCol w:w="2040"/>
+        <w:gridCol w:w="1457"/>
+        <w:gridCol w:w="1457"/>
+        <w:gridCol w:w="1457"/>
+        <w:gridCol w:w="1457"/>
+        <w:gridCol w:w="1457"/>
+        <w:gridCol w:w="1457"/>
+        <w:gridCol w:w="1457"/>
       </w:tblGrid>
       <w:tr>
         <w:tc>
           <w:tcPr>
-            <w:tcW w:type="dxa" w:w="2494"/>
+            <w:tcW w:type="dxa" w:w="2041"/>
             <w:shd w:val="clear" w:fill="434343"/>
           </w:tcPr>
           <w:p>
@@ -20706,7 +20708,7 @@
         </w:tc>
         <w:tc>
           <w:tcPr>
-            <w:tcW w:type="dxa" w:w="1701"/>
+            <w:tcW w:type="dxa" w:w="1417"/>
             <w:shd w:val="clear" w:fill="434343"/>
           </w:tcPr>
           <w:p>
@@ -20726,7 +20728,7 @@
         </w:tc>
         <w:tc>
           <w:tcPr>
-            <w:tcW w:type="dxa" w:w="1587"/>
+            <w:tcW w:type="dxa" w:w="1247"/>
             <w:shd w:val="clear" w:fill="434343"/>
           </w:tcPr>
           <w:p>
@@ -20740,13 +20742,13 @@
                 <w:color w:val="FFFFFF"/>
                 <w:sz w:val="16"/>
               </w:rPr>
-              <w:t>Marka geçen</w:t>
-            </w:r>
-          </w:p>
-        </w:tc>
-        <w:tc>
-          <w:tcPr>
-            <w:tcW w:type="dxa" w:w="1587"/>
+              <w:t>Mention</w:t>
+            </w:r>
+          </w:p>
+        </w:tc>
+        <w:tc>
+          <w:tcPr>
+            <w:tcW w:type="dxa" w:w="1361"/>
             <w:shd w:val="clear" w:fill="434343"/>
           </w:tcPr>
           <w:p>
@@ -20766,7 +20768,7 @@
         </w:tc>
         <w:tc>
           <w:tcPr>
-            <w:tcW w:type="dxa" w:w="1928"/>
+            <w:tcW w:type="dxa" w:w="1474"/>
             <w:shd w:val="clear" w:fill="434343"/>
           </w:tcPr>
           <w:p>
@@ -20780,6 +20782,46 @@
                 <w:color w:val="FFFFFF"/>
                 <w:sz w:val="16"/>
               </w:rPr>
+              <w:t>Site citation</w:t>
+            </w:r>
+          </w:p>
+        </w:tc>
+        <w:tc>
+          <w:tcPr>
+            <w:tcW w:type="dxa" w:w="1417"/>
+            <w:shd w:val="clear" w:fill="434343"/>
+          </w:tcPr>
+          <w:p>
+            <w:pPr>
+              <w:jc w:val="center"/>
+            </w:pPr>
+            <w:r/>
+            <w:r>
+              <w:rPr>
+                <w:b/>
+                <w:color w:val="FFFFFF"/>
+                <w:sz w:val="16"/>
+              </w:rPr>
+              <w:t>Citation oranı</w:t>
+            </w:r>
+          </w:p>
+        </w:tc>
+        <w:tc>
+          <w:tcPr>
+            <w:tcW w:type="dxa" w:w="1587"/>
+            <w:shd w:val="clear" w:fill="434343"/>
+          </w:tcPr>
+          <w:p>
+            <w:pPr>
+              <w:jc w:val="center"/>
+            </w:pPr>
+            <w:r/>
+            <w:r>
+              <w:rPr>
+                <w:b/>
+                <w:color w:val="FFFFFF"/>
+                <w:sz w:val="16"/>
+              </w:rPr>
               <w:t>Ort. marka sırası</w:t>
             </w:r>
           </w:p>
@@ -20788,7 +20830,7 @@
       <w:tr>
         <w:tc>
           <w:tcPr>
-            <w:tcW w:type="dxa" w:w="2494"/>
+            <w:tcW w:type="dxa" w:w="2041"/>
           </w:tcPr>
           <w:p>
             <w:pPr>
@@ -20806,7 +20848,7 @@
         </w:tc>
         <w:tc>
           <w:tcPr>
-            <w:tcW w:type="dxa" w:w="1701"/>
+            <w:tcW w:type="dxa" w:w="1417"/>
           </w:tcPr>
           <w:p>
             <w:pPr>
@@ -20825,45 +20867,83 @@
         </w:tc>
         <w:tc>
           <w:tcPr>
+            <w:tcW w:type="dxa" w:w="1247"/>
+          </w:tcPr>
+          <w:p>
+            <w:pPr>
+              <w:spacing w:after="20"/>
+              <w:jc w:val="center"/>
+            </w:pPr>
+            <w:r/>
+            <w:r>
+              <w:rPr>
+                <w:color w:val="10332F"/>
+                <w:sz w:val="17"/>
+              </w:rPr>
+              <w:t>111</w:t>
+            </w:r>
+          </w:p>
+        </w:tc>
+        <w:tc>
+          <w:tcPr>
+            <w:tcW w:type="dxa" w:w="1361"/>
+          </w:tcPr>
+          <w:p>
+            <w:pPr>
+              <w:spacing w:after="20"/>
+              <w:jc w:val="center"/>
+            </w:pPr>
+            <w:r/>
+            <w:r>
+              <w:rPr>
+                <w:color w:val="10332F"/>
+                <w:sz w:val="17"/>
+              </w:rPr>
+              <w:t>%58.4</w:t>
+            </w:r>
+          </w:p>
+        </w:tc>
+        <w:tc>
+          <w:tcPr>
+            <w:tcW w:type="dxa" w:w="1474"/>
+          </w:tcPr>
+          <w:p>
+            <w:pPr>
+              <w:spacing w:after="20"/>
+              <w:jc w:val="center"/>
+            </w:pPr>
+            <w:r/>
+            <w:r>
+              <w:rPr>
+                <w:color w:val="10332F"/>
+                <w:sz w:val="17"/>
+              </w:rPr>
+              <w:t>48 / 190</w:t>
+            </w:r>
+          </w:p>
+        </w:tc>
+        <w:tc>
+          <w:tcPr>
+            <w:tcW w:type="dxa" w:w="1417"/>
+          </w:tcPr>
+          <w:p>
+            <w:pPr>
+              <w:spacing w:after="20"/>
+              <w:jc w:val="center"/>
+            </w:pPr>
+            <w:r/>
+            <w:r>
+              <w:rPr>
+                <w:color w:val="10332F"/>
+                <w:sz w:val="17"/>
+              </w:rPr>
+              <w:t>%25.3</w:t>
+            </w:r>
+          </w:p>
+        </w:tc>
+        <w:tc>
+          <w:tcPr>
             <w:tcW w:type="dxa" w:w="1587"/>
-          </w:tcPr>
-          <w:p>
-            <w:pPr>
-              <w:spacing w:after="20"/>
-              <w:jc w:val="center"/>
-            </w:pPr>
-            <w:r/>
-            <w:r>
-              <w:rPr>
-                <w:color w:val="10332F"/>
-                <w:sz w:val="17"/>
-              </w:rPr>
-              <w:t>111</w:t>
-            </w:r>
-          </w:p>
-        </w:tc>
-        <w:tc>
-          <w:tcPr>
-            <w:tcW w:type="dxa" w:w="1587"/>
-          </w:tcPr>
-          <w:p>
-            <w:pPr>
-              <w:spacing w:after="20"/>
-              <w:jc w:val="center"/>
-            </w:pPr>
-            <w:r/>
-            <w:r>
-              <w:rPr>
-                <w:color w:val="10332F"/>
-                <w:sz w:val="17"/>
-              </w:rPr>
-              <w:t>%58.4</w:t>
-            </w:r>
-          </w:p>
-        </w:tc>
-        <w:tc>
-          <w:tcPr>
-            <w:tcW w:type="dxa" w:w="1928"/>
           </w:tcPr>
           <w:p>
             <w:pPr>
@@ -20884,7 +20964,7 @@
       <w:tr>
         <w:tc>
           <w:tcPr>
-            <w:tcW w:type="dxa" w:w="2494"/>
+            <w:tcW w:type="dxa" w:w="2041"/>
           </w:tcPr>
           <w:p>
             <w:pPr>
@@ -20902,7 +20982,7 @@
         </w:tc>
         <w:tc>
           <w:tcPr>
-            <w:tcW w:type="dxa" w:w="1701"/>
+            <w:tcW w:type="dxa" w:w="1417"/>
           </w:tcPr>
           <w:p>
             <w:pPr>
@@ -20921,45 +21001,83 @@
         </w:tc>
         <w:tc>
           <w:tcPr>
+            <w:tcW w:type="dxa" w:w="1247"/>
+          </w:tcPr>
+          <w:p>
+            <w:pPr>
+              <w:spacing w:after="20"/>
+              <w:jc w:val="center"/>
+            </w:pPr>
+            <w:r/>
+            <w:r>
+              <w:rPr>
+                <w:color w:val="10332F"/>
+                <w:sz w:val="17"/>
+              </w:rPr>
+              <w:t>48</w:t>
+            </w:r>
+          </w:p>
+        </w:tc>
+        <w:tc>
+          <w:tcPr>
+            <w:tcW w:type="dxa" w:w="1361"/>
+          </w:tcPr>
+          <w:p>
+            <w:pPr>
+              <w:spacing w:after="20"/>
+              <w:jc w:val="center"/>
+            </w:pPr>
+            <w:r/>
+            <w:r>
+              <w:rPr>
+                <w:color w:val="10332F"/>
+                <w:sz w:val="17"/>
+              </w:rPr>
+              <w:t>%37.2</w:t>
+            </w:r>
+          </w:p>
+        </w:tc>
+        <w:tc>
+          <w:tcPr>
+            <w:tcW w:type="dxa" w:w="1474"/>
+          </w:tcPr>
+          <w:p>
+            <w:pPr>
+              <w:spacing w:after="20"/>
+              <w:jc w:val="center"/>
+            </w:pPr>
+            <w:r/>
+            <w:r>
+              <w:rPr>
+                <w:color w:val="10332F"/>
+                <w:sz w:val="17"/>
+              </w:rPr>
+              <w:t>26 / 129</w:t>
+            </w:r>
+          </w:p>
+        </w:tc>
+        <w:tc>
+          <w:tcPr>
+            <w:tcW w:type="dxa" w:w="1417"/>
+          </w:tcPr>
+          <w:p>
+            <w:pPr>
+              <w:spacing w:after="20"/>
+              <w:jc w:val="center"/>
+            </w:pPr>
+            <w:r/>
+            <w:r>
+              <w:rPr>
+                <w:color w:val="10332F"/>
+                <w:sz w:val="17"/>
+              </w:rPr>
+              <w:t>%20.2</w:t>
+            </w:r>
+          </w:p>
+        </w:tc>
+        <w:tc>
+          <w:tcPr>
             <w:tcW w:type="dxa" w:w="1587"/>
-          </w:tcPr>
-          <w:p>
-            <w:pPr>
-              <w:spacing w:after="20"/>
-              <w:jc w:val="center"/>
-            </w:pPr>
-            <w:r/>
-            <w:r>
-              <w:rPr>
-                <w:color w:val="10332F"/>
-                <w:sz w:val="17"/>
-              </w:rPr>
-              <w:t>48</w:t>
-            </w:r>
-          </w:p>
-        </w:tc>
-        <w:tc>
-          <w:tcPr>
-            <w:tcW w:type="dxa" w:w="1587"/>
-          </w:tcPr>
-          <w:p>
-            <w:pPr>
-              <w:spacing w:after="20"/>
-              <w:jc w:val="center"/>
-            </w:pPr>
-            <w:r/>
-            <w:r>
-              <w:rPr>
-                <w:color w:val="10332F"/>
-                <w:sz w:val="17"/>
-              </w:rPr>
-              <w:t>%37.2</w:t>
-            </w:r>
-          </w:p>
-        </w:tc>
-        <w:tc>
-          <w:tcPr>
-            <w:tcW w:type="dxa" w:w="1928"/>
           </w:tcPr>
           <w:p>
             <w:pPr>
@@ -20980,7 +21098,7 @@
       <w:tr>
         <w:tc>
           <w:tcPr>
-            <w:tcW w:type="dxa" w:w="2494"/>
+            <w:tcW w:type="dxa" w:w="2041"/>
           </w:tcPr>
           <w:p>
             <w:pPr>
@@ -20998,7 +21116,7 @@
         </w:tc>
         <w:tc>
           <w:tcPr>
-            <w:tcW w:type="dxa" w:w="1701"/>
+            <w:tcW w:type="dxa" w:w="1417"/>
           </w:tcPr>
           <w:p>
             <w:pPr>
@@ -21017,45 +21135,83 @@
         </w:tc>
         <w:tc>
           <w:tcPr>
+            <w:tcW w:type="dxa" w:w="1247"/>
+          </w:tcPr>
+          <w:p>
+            <w:pPr>
+              <w:spacing w:after="20"/>
+              <w:jc w:val="center"/>
+            </w:pPr>
+            <w:r/>
+            <w:r>
+              <w:rPr>
+                <w:color w:val="10332F"/>
+                <w:sz w:val="17"/>
+              </w:rPr>
+              <w:t>52</w:t>
+            </w:r>
+          </w:p>
+        </w:tc>
+        <w:tc>
+          <w:tcPr>
+            <w:tcW w:type="dxa" w:w="1361"/>
+          </w:tcPr>
+          <w:p>
+            <w:pPr>
+              <w:spacing w:after="20"/>
+              <w:jc w:val="center"/>
+            </w:pPr>
+            <w:r/>
+            <w:r>
+              <w:rPr>
+                <w:color w:val="10332F"/>
+                <w:sz w:val="17"/>
+              </w:rPr>
+              <w:t>%28.0</w:t>
+            </w:r>
+          </w:p>
+        </w:tc>
+        <w:tc>
+          <w:tcPr>
+            <w:tcW w:type="dxa" w:w="1474"/>
+          </w:tcPr>
+          <w:p>
+            <w:pPr>
+              <w:spacing w:after="20"/>
+              <w:jc w:val="center"/>
+            </w:pPr>
+            <w:r/>
+            <w:r>
+              <w:rPr>
+                <w:color w:val="10332F"/>
+                <w:sz w:val="17"/>
+              </w:rPr>
+              <w:t>30 / 186</w:t>
+            </w:r>
+          </w:p>
+        </w:tc>
+        <w:tc>
+          <w:tcPr>
+            <w:tcW w:type="dxa" w:w="1417"/>
+          </w:tcPr>
+          <w:p>
+            <w:pPr>
+              <w:spacing w:after="20"/>
+              <w:jc w:val="center"/>
+            </w:pPr>
+            <w:r/>
+            <w:r>
+              <w:rPr>
+                <w:color w:val="10332F"/>
+                <w:sz w:val="17"/>
+              </w:rPr>
+              <w:t>%16.1</w:t>
+            </w:r>
+          </w:p>
+        </w:tc>
+        <w:tc>
+          <w:tcPr>
             <w:tcW w:type="dxa" w:w="1587"/>
-          </w:tcPr>
-          <w:p>
-            <w:pPr>
-              <w:spacing w:after="20"/>
-              <w:jc w:val="center"/>
-            </w:pPr>
-            <w:r/>
-            <w:r>
-              <w:rPr>
-                <w:color w:val="10332F"/>
-                <w:sz w:val="17"/>
-              </w:rPr>
-              <w:t>52</w:t>
-            </w:r>
-          </w:p>
-        </w:tc>
-        <w:tc>
-          <w:tcPr>
-            <w:tcW w:type="dxa" w:w="1587"/>
-          </w:tcPr>
-          <w:p>
-            <w:pPr>
-              <w:spacing w:after="20"/>
-              <w:jc w:val="center"/>
-            </w:pPr>
-            <w:r/>
-            <w:r>
-              <w:rPr>
-                <w:color w:val="10332F"/>
-                <w:sz w:val="17"/>
-              </w:rPr>
-              <w:t>%28.0</w:t>
-            </w:r>
-          </w:p>
-        </w:tc>
-        <w:tc>
-          <w:tcPr>
-            <w:tcW w:type="dxa" w:w="1928"/>
           </w:tcPr>
           <w:p>
             <w:pPr>
@@ -21084,7 +21240,7 @@
           <w:color w:val="7C8B88"/>
           <w:sz w:val="16"/>
         </w:rPr>
-        <w:t>Kaynak: Inbound AI görünürlük izleme · 1-12 Ağu 2026 · 100 aktif prompt · 505 taranan yanıt</w:t>
+        <w:t>Kaynak: Inbound AI görünürlük izleme · 1-12 Ağu 2026 · 100 aktif prompt · 505 taranan yanıt · Mention: marka adının yanıt metninde geçmesi · Site citation: yanıtın kaynak olarak marka sitesine bağlanması</w:t>
       </w:r>
     </w:p>
     <w:p>

</xml_diff>